<commit_message>
docs: updated version number
</commit_message>
<xml_diff>
--- a/documentation/SRS.docx
+++ b/documentation/SRS.docx
@@ -113,7 +113,160 @@
         <w:pStyle w:val="IntenseQuote"/>
       </w:pPr>
       <w:r>
-        <w:t>Version: v1.0.0</w:t>
+        <w:t>Version: v1.0.1</w:t>
+      </w:r>
+    </w:p>
+    <w:p>
+      <w:pPr>
+        <w:spacing w:after="0" w:line="240" w:lineRule="auto"/>
+        <w:rPr>
+          <w:rFonts w:ascii="Times New Roman" w:eastAsia="Times New Roman" w:hAnsi="Times New Roman" w:cs="Times New Roman"/>
+          <w:kern w:val="0"/>
+          <w:lang w:eastAsia="en-001"/>
+          <w14:ligatures w14:val="none"/>
+        </w:rPr>
+      </w:pPr>
+      <w:r>
+        <w:rPr>
+          <w:rFonts w:ascii="Times New Roman" w:eastAsia="Times New Roman" w:hAnsi="Times New Roman" w:cs="Times New Roman"/>
+          <w:kern w:val="0"/>
+          <w:lang w:eastAsia="en-001"/>
+          <w14:ligatures w14:val="none"/>
+        </w:rPr>
+        <w:pict>
+          <v:rect id="_x0000_i1025" style="width:0;height:1.5pt" o:hralign="center" o:hrstd="t" o:hr="t" fillcolor="#a0a0a0" stroked="f"/>
+        </w:pict>
+      </w:r>
+    </w:p>
+    <w:p>
+      <w:pPr>
+        <w:spacing w:before="100" w:beforeAutospacing="1" w:after="100" w:afterAutospacing="1" w:line="240" w:lineRule="auto"/>
+        <w:outlineLvl w:val="1"/>
+        <w:rPr>
+          <w:rFonts w:ascii="Times New Roman" w:eastAsia="Times New Roman" w:hAnsi="Times New Roman" w:cs="Times New Roman"/>
+          <w:b/>
+          <w:bCs/>
+          <w:kern w:val="0"/>
+          <w:sz w:val="36"/>
+          <w:szCs w:val="36"/>
+          <w:lang w:eastAsia="en-001"/>
+          <w14:ligatures w14:val="none"/>
+        </w:rPr>
+      </w:pPr>
+      <w:r>
+        <w:rPr>
+          <w:rFonts w:ascii="Times New Roman" w:eastAsia="Times New Roman" w:hAnsi="Times New Roman" w:cs="Times New Roman"/>
+          <w:b/>
+          <w:bCs/>
+          <w:kern w:val="0"/>
+          <w:sz w:val="36"/>
+          <w:szCs w:val="36"/>
+          <w:lang w:eastAsia="en-001"/>
+          <w14:ligatures w14:val="none"/>
+        </w:rPr>
+        <w:t>1. Introduction</w:t>
+      </w:r>
+    </w:p>
+    <w:p>
+      <w:pPr>
+        <w:spacing w:before="100" w:beforeAutospacing="1" w:after="100" w:afterAutospacing="1" w:line="240" w:lineRule="auto"/>
+        <w:outlineLvl w:val="2"/>
+        <w:rPr>
+          <w:rFonts w:ascii="Times New Roman" w:eastAsia="Times New Roman" w:hAnsi="Times New Roman" w:cs="Times New Roman"/>
+          <w:b/>
+          <w:bCs/>
+          <w:kern w:val="0"/>
+          <w:sz w:val="27"/>
+          <w:szCs w:val="27"/>
+          <w:lang w:eastAsia="en-001"/>
+          <w14:ligatures w14:val="none"/>
+        </w:rPr>
+      </w:pPr>
+      <w:r>
+        <w:rPr>
+          <w:rFonts w:ascii="Times New Roman" w:eastAsia="Times New Roman" w:hAnsi="Times New Roman" w:cs="Times New Roman"/>
+          <w:b/>
+          <w:bCs/>
+          <w:kern w:val="0"/>
+          <w:sz w:val="27"/>
+          <w:szCs w:val="27"/>
+          <w:lang w:eastAsia="en-001"/>
+          <w14:ligatures w14:val="none"/>
+        </w:rPr>
+        <w:t>1.1 Purpose</w:t>
+      </w:r>
+    </w:p>
+    <w:p>
+      <w:pPr>
+        <w:spacing w:before="100" w:beforeAutospacing="1" w:after="100" w:afterAutospacing="1" w:line="240" w:lineRule="auto"/>
+        <w:rPr>
+          <w:rFonts w:ascii="Times New Roman" w:eastAsia="Times New Roman" w:hAnsi="Times New Roman" w:cs="Times New Roman"/>
+          <w:kern w:val="0"/>
+          <w:lang w:eastAsia="en-001"/>
+          <w14:ligatures w14:val="none"/>
+        </w:rPr>
+      </w:pPr>
+      <w:r>
+        <w:rPr>
+          <w:rFonts w:ascii="Times New Roman" w:eastAsia="Times New Roman" w:hAnsi="Times New Roman" w:cs="Times New Roman"/>
+          <w:kern w:val="0"/>
+          <w:lang w:eastAsia="en-001"/>
+          <w14:ligatures w14:val="none"/>
+        </w:rPr>
+        <w:t xml:space="preserve">This document describes the Software Requirements Specification (SRS) for </w:t>
+      </w:r>
+      <w:proofErr w:type="spellStart"/>
+      <w:r>
+        <w:rPr>
+          <w:rFonts w:ascii="Times New Roman" w:eastAsia="Times New Roman" w:hAnsi="Times New Roman" w:cs="Times New Roman"/>
+          <w:b/>
+          <w:bCs/>
+          <w:kern w:val="0"/>
+          <w:lang w:eastAsia="en-001"/>
+          <w14:ligatures w14:val="none"/>
+        </w:rPr>
+        <w:t>LokVeda</w:t>
+      </w:r>
+      <w:proofErr w:type="spellEnd"/>
+      <w:r>
+        <w:rPr>
+          <w:rFonts w:ascii="Times New Roman" w:eastAsia="Times New Roman" w:hAnsi="Times New Roman" w:cs="Times New Roman"/>
+          <w:b/>
+          <w:bCs/>
+          <w:kern w:val="0"/>
+          <w:lang w:eastAsia="en-001"/>
+          <w14:ligatures w14:val="none"/>
+        </w:rPr>
+        <w:t xml:space="preserve"> — Your E-Gram Panchayat</w:t>
+      </w:r>
+      <w:r>
+        <w:rPr>
+          <w:rFonts w:ascii="Times New Roman" w:eastAsia="Times New Roman" w:hAnsi="Times New Roman" w:cs="Times New Roman"/>
+          <w:kern w:val="0"/>
+          <w:lang w:eastAsia="en-001"/>
+          <w14:ligatures w14:val="none"/>
+        </w:rPr>
+        <w:t>, an academic web-based application developed to digitally represent core functionalities of a village-level governance system.</w:t>
+      </w:r>
+    </w:p>
+    <w:p>
+      <w:pPr>
+        <w:spacing w:before="100" w:beforeAutospacing="1" w:after="100" w:afterAutospacing="1" w:line="240" w:lineRule="auto"/>
+        <w:rPr>
+          <w:rFonts w:ascii="Times New Roman" w:eastAsia="Times New Roman" w:hAnsi="Times New Roman" w:cs="Times New Roman"/>
+          <w:kern w:val="0"/>
+          <w:lang w:eastAsia="en-001"/>
+          <w14:ligatures w14:val="none"/>
+        </w:rPr>
+      </w:pPr>
+      <w:r>
+        <w:rPr>
+          <w:rFonts w:ascii="Times New Roman" w:eastAsia="Times New Roman" w:hAnsi="Times New Roman" w:cs="Times New Roman"/>
+          <w:kern w:val="0"/>
+          <w:lang w:eastAsia="en-001"/>
+          <w14:ligatures w14:val="none"/>
+        </w:rPr>
+        <w:t>The purpose of this document is to provide a clear understanding of the system’s functionality, design constraints, and future scope for academic evaluation and documentation.</w:t>
       </w:r>
     </w:p>
     <w:p>
@@ -135,159 +288,6 @@
         </w:rPr>
         <w:pict>
           <v:rect id="_x0000_i1026" style="width:0;height:1.5pt" o:hralign="center" o:hrstd="t" o:hr="t" fillcolor="#a0a0a0" stroked="f"/>
-        </w:pict>
-      </w:r>
-    </w:p>
-    <w:p>
-      <w:pPr>
-        <w:spacing w:before="100" w:beforeAutospacing="1" w:after="100" w:afterAutospacing="1" w:line="240" w:lineRule="auto"/>
-        <w:outlineLvl w:val="1"/>
-        <w:rPr>
-          <w:rFonts w:ascii="Times New Roman" w:eastAsia="Times New Roman" w:hAnsi="Times New Roman" w:cs="Times New Roman"/>
-          <w:b/>
-          <w:bCs/>
-          <w:kern w:val="0"/>
-          <w:sz w:val="36"/>
-          <w:szCs w:val="36"/>
-          <w:lang w:eastAsia="en-001"/>
-          <w14:ligatures w14:val="none"/>
-        </w:rPr>
-      </w:pPr>
-      <w:r>
-        <w:rPr>
-          <w:rFonts w:ascii="Times New Roman" w:eastAsia="Times New Roman" w:hAnsi="Times New Roman" w:cs="Times New Roman"/>
-          <w:b/>
-          <w:bCs/>
-          <w:kern w:val="0"/>
-          <w:sz w:val="36"/>
-          <w:szCs w:val="36"/>
-          <w:lang w:eastAsia="en-001"/>
-          <w14:ligatures w14:val="none"/>
-        </w:rPr>
-        <w:t>1. Introduction</w:t>
-      </w:r>
-    </w:p>
-    <w:p>
-      <w:pPr>
-        <w:spacing w:before="100" w:beforeAutospacing="1" w:after="100" w:afterAutospacing="1" w:line="240" w:lineRule="auto"/>
-        <w:outlineLvl w:val="2"/>
-        <w:rPr>
-          <w:rFonts w:ascii="Times New Roman" w:eastAsia="Times New Roman" w:hAnsi="Times New Roman" w:cs="Times New Roman"/>
-          <w:b/>
-          <w:bCs/>
-          <w:kern w:val="0"/>
-          <w:sz w:val="27"/>
-          <w:szCs w:val="27"/>
-          <w:lang w:eastAsia="en-001"/>
-          <w14:ligatures w14:val="none"/>
-        </w:rPr>
-      </w:pPr>
-      <w:r>
-        <w:rPr>
-          <w:rFonts w:ascii="Times New Roman" w:eastAsia="Times New Roman" w:hAnsi="Times New Roman" w:cs="Times New Roman"/>
-          <w:b/>
-          <w:bCs/>
-          <w:kern w:val="0"/>
-          <w:sz w:val="27"/>
-          <w:szCs w:val="27"/>
-          <w:lang w:eastAsia="en-001"/>
-          <w14:ligatures w14:val="none"/>
-        </w:rPr>
-        <w:t>1.1 Purpose</w:t>
-      </w:r>
-    </w:p>
-    <w:p>
-      <w:pPr>
-        <w:spacing w:before="100" w:beforeAutospacing="1" w:after="100" w:afterAutospacing="1" w:line="240" w:lineRule="auto"/>
-        <w:rPr>
-          <w:rFonts w:ascii="Times New Roman" w:eastAsia="Times New Roman" w:hAnsi="Times New Roman" w:cs="Times New Roman"/>
-          <w:kern w:val="0"/>
-          <w:lang w:eastAsia="en-001"/>
-          <w14:ligatures w14:val="none"/>
-        </w:rPr>
-      </w:pPr>
-      <w:r>
-        <w:rPr>
-          <w:rFonts w:ascii="Times New Roman" w:eastAsia="Times New Roman" w:hAnsi="Times New Roman" w:cs="Times New Roman"/>
-          <w:kern w:val="0"/>
-          <w:lang w:eastAsia="en-001"/>
-          <w14:ligatures w14:val="none"/>
-        </w:rPr>
-        <w:t xml:space="preserve">This document describes the Software Requirements Specification (SRS) for </w:t>
-      </w:r>
-      <w:proofErr w:type="spellStart"/>
-      <w:r>
-        <w:rPr>
-          <w:rFonts w:ascii="Times New Roman" w:eastAsia="Times New Roman" w:hAnsi="Times New Roman" w:cs="Times New Roman"/>
-          <w:b/>
-          <w:bCs/>
-          <w:kern w:val="0"/>
-          <w:lang w:eastAsia="en-001"/>
-          <w14:ligatures w14:val="none"/>
-        </w:rPr>
-        <w:t>LokVeda</w:t>
-      </w:r>
-      <w:proofErr w:type="spellEnd"/>
-      <w:r>
-        <w:rPr>
-          <w:rFonts w:ascii="Times New Roman" w:eastAsia="Times New Roman" w:hAnsi="Times New Roman" w:cs="Times New Roman"/>
-          <w:b/>
-          <w:bCs/>
-          <w:kern w:val="0"/>
-          <w:lang w:eastAsia="en-001"/>
-          <w14:ligatures w14:val="none"/>
-        </w:rPr>
-        <w:t xml:space="preserve"> — Your E-Gram Panchayat</w:t>
-      </w:r>
-      <w:r>
-        <w:rPr>
-          <w:rFonts w:ascii="Times New Roman" w:eastAsia="Times New Roman" w:hAnsi="Times New Roman" w:cs="Times New Roman"/>
-          <w:kern w:val="0"/>
-          <w:lang w:eastAsia="en-001"/>
-          <w14:ligatures w14:val="none"/>
-        </w:rPr>
-        <w:t>, an academic web-based application developed to digitally represent core functionalities of a village-level governance system.</w:t>
-      </w:r>
-    </w:p>
-    <w:p>
-      <w:pPr>
-        <w:spacing w:before="100" w:beforeAutospacing="1" w:after="100" w:afterAutospacing="1" w:line="240" w:lineRule="auto"/>
-        <w:rPr>
-          <w:rFonts w:ascii="Times New Roman" w:eastAsia="Times New Roman" w:hAnsi="Times New Roman" w:cs="Times New Roman"/>
-          <w:kern w:val="0"/>
-          <w:lang w:eastAsia="en-001"/>
-          <w14:ligatures w14:val="none"/>
-        </w:rPr>
-      </w:pPr>
-      <w:r>
-        <w:rPr>
-          <w:rFonts w:ascii="Times New Roman" w:eastAsia="Times New Roman" w:hAnsi="Times New Roman" w:cs="Times New Roman"/>
-          <w:kern w:val="0"/>
-          <w:lang w:eastAsia="en-001"/>
-          <w14:ligatures w14:val="none"/>
-        </w:rPr>
-        <w:t>The purpose of this document is to provide a clear understanding of the system’s functionality, design constraints, and future scope for academic evaluation and documentation.</w:t>
-      </w:r>
-    </w:p>
-    <w:p>
-      <w:pPr>
-        <w:spacing w:after="0" w:line="240" w:lineRule="auto"/>
-        <w:rPr>
-          <w:rFonts w:ascii="Times New Roman" w:eastAsia="Times New Roman" w:hAnsi="Times New Roman" w:cs="Times New Roman"/>
-          <w:kern w:val="0"/>
-          <w:lang w:eastAsia="en-001"/>
-          <w14:ligatures w14:val="none"/>
-        </w:rPr>
-      </w:pPr>
-      <w:r>
-        <w:rPr>
-          <w:rFonts w:ascii="Times New Roman" w:eastAsia="Times New Roman" w:hAnsi="Times New Roman" w:cs="Times New Roman"/>
-          <w:kern w:val="0"/>
-          <w:lang w:eastAsia="en-001"/>
-          <w14:ligatures w14:val="none"/>
-        </w:rPr>
-        <w:pict>
-          <v:rect id="_x0000_i1027" style="width:0;height:1.5pt" o:hralign="center" o:hrstd="t" o:hr="t" fillcolor="#a0a0a0" stroked="f"/>
         </w:pict>
       </w:r>
     </w:p>
@@ -593,7 +593,7 @@
           <w14:ligatures w14:val="none"/>
         </w:rPr>
         <w:pict>
-          <v:rect id="_x0000_i1028" style="width:0;height:1.5pt" o:hralign="center" o:hrstd="t" o:hr="t" fillcolor="#a0a0a0" stroked="f"/>
+          <v:rect id="_x0000_i1027" style="width:0;height:1.5pt" o:hralign="center" o:hrstd="t" o:hr="t" fillcolor="#a0a0a0" stroked="f"/>
         </w:pict>
       </w:r>
     </w:p>
@@ -855,7 +855,7 @@
           <w14:ligatures w14:val="none"/>
         </w:rPr>
         <w:pict>
-          <v:rect id="_x0000_i1029" style="width:0;height:1.5pt" o:hralign="center" o:hrstd="t" o:hr="t" fillcolor="#a0a0a0" stroked="f"/>
+          <v:rect id="_x0000_i1028" style="width:0;height:1.5pt" o:hralign="center" o:hrstd="t" o:hr="t" fillcolor="#a0a0a0" stroked="f"/>
         </w:pict>
       </w:r>
     </w:p>
@@ -978,7 +978,7 @@
           <w14:ligatures w14:val="none"/>
         </w:rPr>
         <w:pict>
-          <v:rect id="_x0000_i1030" style="width:0;height:1.5pt" o:hralign="center" o:hrstd="t" o:hr="t" fillcolor="#a0a0a0" stroked="f"/>
+          <v:rect id="_x0000_i1029" style="width:0;height:1.5pt" o:hralign="center" o:hrstd="t" o:hr="t" fillcolor="#a0a0a0" stroked="f"/>
         </w:pict>
       </w:r>
     </w:p>
@@ -1169,7 +1169,7 @@
           <w14:ligatures w14:val="none"/>
         </w:rPr>
         <w:pict>
-          <v:rect id="_x0000_i1031" style="width:0;height:1.5pt" o:hralign="center" o:hrstd="t" o:hr="t" fillcolor="#a0a0a0" stroked="f"/>
+          <v:rect id="_x0000_i1030" style="width:0;height:1.5pt" o:hralign="center" o:hrstd="t" o:hr="t" fillcolor="#a0a0a0" stroked="f"/>
         </w:pict>
       </w:r>
     </w:p>
@@ -1456,7 +1456,7 @@
           <w14:ligatures w14:val="none"/>
         </w:rPr>
         <w:pict>
-          <v:rect id="_x0000_i1032" style="width:0;height:1.5pt" o:hralign="center" o:hrstd="t" o:hr="t" fillcolor="#a0a0a0" stroked="f"/>
+          <v:rect id="_x0000_i1031" style="width:0;height:1.5pt" o:hralign="center" o:hrstd="t" o:hr="t" fillcolor="#a0a0a0" stroked="f"/>
         </w:pict>
       </w:r>
     </w:p>
@@ -1745,7 +1745,7 @@
           <w14:ligatures w14:val="none"/>
         </w:rPr>
         <w:pict>
-          <v:rect id="_x0000_i1033" style="width:0;height:1.5pt" o:hralign="center" o:hrstd="t" o:hr="t" fillcolor="#a0a0a0" stroked="f"/>
+          <v:rect id="_x0000_i1032" style="width:0;height:1.5pt" o:hralign="center" o:hrstd="t" o:hr="t" fillcolor="#a0a0a0" stroked="f"/>
         </w:pict>
       </w:r>
     </w:p>
@@ -1892,7 +1892,7 @@
           <w14:ligatures w14:val="none"/>
         </w:rPr>
         <w:pict>
-          <v:rect id="_x0000_i1034" style="width:0;height:1.5pt" o:hralign="center" o:hrstd="t" o:hr="t" fillcolor="#a0a0a0" stroked="f"/>
+          <v:rect id="_x0000_i1033" style="width:0;height:1.5pt" o:hralign="center" o:hrstd="t" o:hr="t" fillcolor="#a0a0a0" stroked="f"/>
         </w:pict>
       </w:r>
     </w:p>
@@ -2050,7 +2050,7 @@
           <w14:ligatures w14:val="none"/>
         </w:rPr>
         <w:pict>
-          <v:rect id="_x0000_i1035" style="width:0;height:1.5pt" o:hralign="center" o:hrstd="t" o:hr="t" fillcolor="#a0a0a0" stroked="f"/>
+          <v:rect id="_x0000_i1034" style="width:0;height:1.5pt" o:hralign="center" o:hrstd="t" o:hr="t" fillcolor="#a0a0a0" stroked="f"/>
         </w:pict>
       </w:r>
     </w:p>
@@ -2173,7 +2173,7 @@
           <w14:ligatures w14:val="none"/>
         </w:rPr>
         <w:pict>
-          <v:rect id="_x0000_i1036" style="width:0;height:1.5pt" o:hralign="center" o:hrstd="t" o:hr="t" fillcolor="#a0a0a0" stroked="f"/>
+          <v:rect id="_x0000_i1035" style="width:0;height:1.5pt" o:hralign="center" o:hrstd="t" o:hr="t" fillcolor="#a0a0a0" stroked="f"/>
         </w:pict>
       </w:r>
     </w:p>
@@ -2349,7 +2349,7 @@
           <w14:ligatures w14:val="none"/>
         </w:rPr>
         <w:pict>
-          <v:rect id="_x0000_i1037" style="width:0;height:1.5pt" o:hralign="center" o:hrstd="t" o:hr="t" fillcolor="#a0a0a0" stroked="f"/>
+          <v:rect id="_x0000_i1036" style="width:0;height:1.5pt" o:hralign="center" o:hrstd="t" o:hr="t" fillcolor="#a0a0a0" stroked="f"/>
         </w:pict>
       </w:r>
     </w:p>
@@ -2497,7 +2497,7 @@
           <w14:ligatures w14:val="none"/>
         </w:rPr>
         <w:pict>
-          <v:rect id="_x0000_i1038" style="width:0;height:1.5pt" o:hralign="center" o:hrstd="t" o:hr="t" fillcolor="#a0a0a0" stroked="f"/>
+          <v:rect id="_x0000_i1037" style="width:0;height:1.5pt" o:hralign="center" o:hrstd="t" o:hr="t" fillcolor="#a0a0a0" stroked="f"/>
         </w:pict>
       </w:r>
     </w:p>
@@ -2620,7 +2620,7 @@
           <w14:ligatures w14:val="none"/>
         </w:rPr>
         <w:pict>
-          <v:rect id="_x0000_i1039" style="width:0;height:1.5pt" o:hralign="center" o:hrstd="t" o:hr="t" fillcolor="#a0a0a0" stroked="f"/>
+          <v:rect id="_x0000_i1038" style="width:0;height:1.5pt" o:hralign="center" o:hrstd="t" o:hr="t" fillcolor="#a0a0a0" stroked="f"/>
         </w:pict>
       </w:r>
     </w:p>
@@ -2767,7 +2767,7 @@
           <w14:ligatures w14:val="none"/>
         </w:rPr>
         <w:pict>
-          <v:rect id="_x0000_i1040" style="width:0;height:1.5pt" o:hralign="center" o:hrstd="t" o:hr="t" fillcolor="#a0a0a0" stroked="f"/>
+          <v:rect id="_x0000_i1039" style="width:0;height:1.5pt" o:hralign="center" o:hrstd="t" o:hr="t" fillcolor="#a0a0a0" stroked="f"/>
         </w:pict>
       </w:r>
     </w:p>
@@ -2914,7 +2914,7 @@
           <w14:ligatures w14:val="none"/>
         </w:rPr>
         <w:pict>
-          <v:rect id="_x0000_i1041" style="width:0;height:1.5pt" o:hralign="center" o:hrstd="t" o:hr="t" fillcolor="#a0a0a0" stroked="f"/>
+          <v:rect id="_x0000_i1040" style="width:0;height:1.5pt" o:hralign="center" o:hrstd="t" o:hr="t" fillcolor="#a0a0a0" stroked="f"/>
         </w:pict>
       </w:r>
     </w:p>
@@ -3037,7 +3037,7 @@
           <w14:ligatures w14:val="none"/>
         </w:rPr>
         <w:pict>
-          <v:rect id="_x0000_i1042" style="width:0;height:1.5pt" o:hralign="center" o:hrstd="t" o:hr="t" fillcolor="#a0a0a0" stroked="f"/>
+          <v:rect id="_x0000_i1041" style="width:0;height:1.5pt" o:hralign="center" o:hrstd="t" o:hr="t" fillcolor="#a0a0a0" stroked="f"/>
         </w:pict>
       </w:r>
     </w:p>
@@ -3214,7 +3214,7 @@
         </w:rPr>
         <w:lastRenderedPageBreak/>
         <w:pict>
-          <v:rect id="_x0000_i1043" style="width:0;height:1.5pt" o:hralign="center" o:hrstd="t" o:hr="t" fillcolor="#a0a0a0" stroked="f"/>
+          <v:rect id="_x0000_i1042" style="width:0;height:1.5pt" o:hralign="center" o:hrstd="t" o:hr="t" fillcolor="#a0a0a0" stroked="f"/>
         </w:pict>
       </w:r>
     </w:p>
@@ -3285,7 +3285,7 @@
           <w14:ligatures w14:val="none"/>
         </w:rPr>
         <w:pict>
-          <v:rect id="_x0000_i1044" style="width:0;height:1.5pt" o:hralign="center" o:hrstd="t" o:hr="t" fillcolor="#a0a0a0" stroked="f"/>
+          <v:rect id="_x0000_i1043" style="width:0;height:1.5pt" o:hralign="center" o:hrstd="t" o:hr="t" fillcolor="#a0a0a0" stroked="f"/>
         </w:pict>
       </w:r>
     </w:p>
@@ -3428,7 +3428,7 @@
           <w14:ligatures w14:val="none"/>
         </w:rPr>
         <w:pict>
-          <v:rect id="_x0000_i1045" style="width:0;height:1.5pt" o:hralign="center" o:hrstd="t" o:hr="t" fillcolor="#a0a0a0" stroked="f"/>
+          <v:rect id="_x0000_i1044" style="width:0;height:1.5pt" o:hralign="center" o:hrstd="t" o:hr="t" fillcolor="#a0a0a0" stroked="f"/>
         </w:pict>
       </w:r>
     </w:p>
@@ -3503,7 +3503,7 @@
           <w14:ligatures w14:val="none"/>
         </w:rPr>
         <w:pict>
-          <v:rect id="_x0000_i1046" style="width:0;height:1.5pt" o:hralign="center" o:hrstd="t" o:hr="t" fillcolor="#a0a0a0" stroked="f"/>
+          <v:rect id="_x0000_i1045" style="width:0;height:1.5pt" o:hralign="center" o:hrstd="t" o:hr="t" fillcolor="#a0a0a0" stroked="f"/>
         </w:pict>
       </w:r>
     </w:p>
@@ -3631,7 +3631,7 @@
           <w14:ligatures w14:val="none"/>
         </w:rPr>
         <w:pict>
-          <v:rect id="_x0000_i1047" style="width:0;height:1.5pt" o:hralign="center" o:hrstd="t" o:hr="t" fillcolor="#a0a0a0" stroked="f"/>
+          <v:rect id="_x0000_i1046" style="width:0;height:1.5pt" o:hralign="center" o:hrstd="t" o:hr="t" fillcolor="#a0a0a0" stroked="f"/>
         </w:pict>
       </w:r>
     </w:p>
@@ -3754,7 +3754,7 @@
           <w14:ligatures w14:val="none"/>
         </w:rPr>
         <w:pict>
-          <v:rect id="_x0000_i1048" style="width:0;height:1.5pt" o:hralign="center" o:hrstd="t" o:hr="t" fillcolor="#a0a0a0" stroked="f"/>
+          <v:rect id="_x0000_i1047" style="width:0;height:1.5pt" o:hralign="center" o:hrstd="t" o:hr="t" fillcolor="#a0a0a0" stroked="f"/>
         </w:pict>
       </w:r>
     </w:p>
@@ -3888,7 +3888,7 @@
           <w14:ligatures w14:val="none"/>
         </w:rPr>
         <w:pict>
-          <v:rect id="_x0000_i1049" style="width:0;height:1.5pt" o:hralign="center" o:hrstd="t" o:hr="t" fillcolor="#a0a0a0" stroked="f"/>
+          <v:rect id="_x0000_i1048" style="width:0;height:1.5pt" o:hralign="center" o:hrstd="t" o:hr="t" fillcolor="#a0a0a0" stroked="f"/>
         </w:pict>
       </w:r>
     </w:p>
@@ -4012,7 +4012,7 @@
           <w14:ligatures w14:val="none"/>
         </w:rPr>
         <w:pict>
-          <v:rect id="_x0000_i1050" style="width:0;height:1.5pt" o:hralign="center" o:hrstd="t" o:hr="t" fillcolor="#a0a0a0" stroked="f"/>
+          <v:rect id="_x0000_i1049" style="width:0;height:1.5pt" o:hralign="center" o:hrstd="t" o:hr="t" fillcolor="#a0a0a0" stroked="f"/>
         </w:pict>
       </w:r>
     </w:p>
@@ -4135,7 +4135,7 @@
           <w14:ligatures w14:val="none"/>
         </w:rPr>
         <w:pict>
-          <v:rect id="_x0000_i1051" style="width:0;height:1.5pt" o:hralign="center" o:hrstd="t" o:hr="t" fillcolor="#a0a0a0" stroked="f"/>
+          <v:rect id="_x0000_i1050" style="width:0;height:1.5pt" o:hralign="center" o:hrstd="t" o:hr="t" fillcolor="#a0a0a0" stroked="f"/>
         </w:pict>
       </w:r>
     </w:p>
@@ -4354,7 +4354,7 @@
           <w14:ligatures w14:val="none"/>
         </w:rPr>
         <w:pict>
-          <v:rect id="_x0000_i1052" style="width:0;height:1.5pt" o:hralign="center" o:hrstd="t" o:hr="t" fillcolor="#a0a0a0" stroked="f"/>
+          <v:rect id="_x0000_i1051" style="width:0;height:1.5pt" o:hralign="center" o:hrstd="t" o:hr="t" fillcolor="#a0a0a0" stroked="f"/>
         </w:pict>
       </w:r>
     </w:p>
@@ -4436,7 +4436,7 @@
           <w14:ligatures w14:val="none"/>
         </w:rPr>
         <w:pict>
-          <v:rect id="_x0000_i1053" style="width:0;height:1.5pt" o:hralign="center" o:hrstd="t" o:hr="t" fillcolor="#a0a0a0" stroked="f"/>
+          <v:rect id="_x0000_i1052" style="width:0;height:1.5pt" o:hralign="center" o:hrstd="t" o:hr="t" fillcolor="#a0a0a0" stroked="f"/>
         </w:pict>
       </w:r>
     </w:p>
@@ -8266,6 +8266,7 @@
   <w:style w:type="character" w:default="1" w:styleId="DefaultParagraphFont">
     <w:name w:val="Default Paragraph Font"/>
     <w:uiPriority w:val="1"/>
+    <w:semiHidden/>
     <w:unhideWhenUsed/>
   </w:style>
   <w:style w:type="table" w:default="1" w:styleId="TableNormal">

</xml_diff>